<commit_message>
Update FAST parsers: plot_feasts.py with SVG spectra, frequency axis, PowerNorm PV; updated docx
</commit_message>
<xml_diff>
--- a/Parsers/FAST/FAST_Data_Structure_IT.docx
+++ b/Parsers/FAST/FAST_Data_Structure_IT.docx
@@ -39,7 +39,49 @@
           <w:i/>
           <w:iCs/>
         </w:rPr>
-        <w:t>Versione documento: 1.0 — 30 luglio 2026</w:t>
+        <w:t>Versione documento: 1.</w:t>
+      </w:r>
+      <w:r>
+        <w:rPr>
+          <w:i/>
+          <w:iCs/>
+        </w:rPr>
+        <w:t>1</w:t>
+      </w:r>
+      <w:r>
+        <w:rPr>
+          <w:i/>
+          <w:iCs/>
+        </w:rPr>
+        <w:t xml:space="preserve"> — </w:t>
+      </w:r>
+      <w:r>
+        <w:rPr>
+          <w:i/>
+          <w:iCs/>
+        </w:rPr>
+        <w:t>5</w:t>
+      </w:r>
+      <w:r>
+        <w:rPr>
+          <w:i/>
+          <w:iCs/>
+        </w:rPr>
+        <w:t xml:space="preserve"> </w:t>
+      </w:r>
+      <w:r>
+        <w:rPr>
+          <w:i/>
+          <w:iCs/>
+        </w:rPr>
+        <w:t>agosto</w:t>
+      </w:r>
+      <w:r>
+        <w:rPr>
+          <w:i/>
+          <w:iCs/>
+        </w:rPr>
+        <w:t xml:space="preserve"> 2026</w:t>
       </w:r>
     </w:p>
     <w:p>
@@ -187,7 +229,7 @@
       </w:pPr>
       <w:r>
         <w:rPr/>
-        <w:t>Sorgente: M33 (Galassia del Triangolo), galassia a spirale del Gruppo Locale a ~840 kpc. Modalità: OTF, singola scansione. Data: 2021-07-30 (UTC 21:34–21:39, ~5 minuti). Beam: M01 (feed centrale). File: M33_OTF_1_MultiBeamOTF-M01_W_0001.fits. Tabella KY: M33_OTF_2021_07_31_05_14_00_000.xlsx. Coordinate reali fornite dal Dr. Jing Wang (NAOC) tramite FAST_KY_to_radec.py. Si tratta di dati di potenza raw non calibrati — l'emissione HI di M33 a ~-180 km/s non è rilevabile senza calibrazione e sottrazione della baseline. Il dataset è usato esclusivamente per la validazione della pipeline.</w:t>
+        <w:t>Sorgente: M33 (Galassia del Triangolo), galassia a spirale del Gruppo Locale a ~840 kpc. Modalità: OTF, singola scansione. Data: 2021-07-30 (UTC 21:34–21:39, ~5 minuti). Beam: M01 (feed centrale). File: M33_OTF_1_MultiBeamOTF-M01_W_0001.fits. Tabella KY: M33_OTF_2021_07_31_05_14_00_000.xlsx. Coordinate reali fornite dal Dr. Chuan-Peng Zhang (NAOC) tramite FAST_KY_to_radec.py. Si tratta di dati di potenza raw non calibrati — l'emissione HI di M33 a ~-180 km/s non è rilevabile senza calibrazione e sottrazione della baseline. Il dataset è usato esclusivamente per la validazione della pipeline.</w:t>
       </w:r>
     </w:p>
     <w:p>
@@ -248,7 +290,7 @@
       </w:pPr>
       <w:r>
         <w:rPr/>
-        <w:t>Dati raw FAST: pubblici dopo 12 mesi di finestra proprietaria tramite fast.bao.ac.cn (registrazione necessaria; volumi enormi — contatto diretto consigliato per trasferimenti in blocco). Dataset campione HiFAST (OTF M33): hifast.readthedocs.io/en/v1.3/examples/example1.html. Cubi ridotti FEASTS (55 galassie): disk.pku.edu.cn/link/AA5A6A26820B154A2F835BE8BE0FD906FD. Pagina dati FEASTS: kavli.pku.edu.cn/~jwang/FEASTS_data.html. Tool coordinate FAST_KY_to_radec.py: fornito dal Dr. Jing Wang (NAOC, cpzhang@nao.cas.cn).</w:t>
+        <w:t>Dati raw FAST: pubblici dopo 12 mesi di finestra proprietaria tramite fast.bao.ac.cn (registrazione necessaria; volumi enormi — contatto diretto consigliato per trasferimenti in blocco). Dataset campione HiFAST (OTF M33): hifast.readthedocs.io/en/v1.3/examples/example1.html. Cubi ridotti FEASTS (55 galassie): disk.pku.edu.cn/link/AA5A6A26820B154A2F835BE8BE0FD906FD. Pagina dati FEASTS: kavli.pku.edu.cn/~jwang/FEASTS_data.html. Tool coordinate FAST_KY_to_radec.py: fornito dal Dr. Chuan-Peng Zhang (NAOC, cpzhang@nao.cas.cn).</w:t>
       </w:r>
     </w:p>
     <w:p>
@@ -764,7 +806,7 @@
       </w:pPr>
       <w:r>
         <w:rPr/>
-        <w:t>FAST_KY_to_radec.py: Dr. Jing Wang, NAOC (cpzhang@nao.cas.cn).</w:t>
+        <w:t>FAST_KY_to_radec.py: Dr. Chuan-Peng Zhang, NAOC (cpzhang@nao.cas.cn).</w:t>
       </w:r>
     </w:p>
     <w:p>
@@ -822,6 +864,7 @@
     <w:qFormat/>
     <w:pPr>
       <w:widowControl/>
+      <w:suppressAutoHyphens w:val="true"/>
       <w:bidi w:val="0"/>
       <w:spacing w:before="0" w:after="0"/>
       <w:jc w:val="start"/>
@@ -837,7 +880,7 @@
   </w:style>
   <w:style w:type="paragraph" w:styleId="Heading1">
     <w:name w:val="heading 1"/>
-    <w:basedOn w:val="Titolo"/>
+    <w:basedOn w:val="Titolouser"/>
     <w:qFormat/>
     <w:pPr/>
     <w:rPr>
@@ -848,7 +891,7 @@
   </w:style>
   <w:style w:type="paragraph" w:styleId="Heading2">
     <w:name w:val="heading 2"/>
-    <w:basedOn w:val="Titolo"/>
+    <w:basedOn w:val="Titolouser"/>
     <w:qFormat/>
     <w:pPr/>
     <w:rPr>
@@ -859,7 +902,7 @@
   </w:style>
   <w:style w:type="paragraph" w:styleId="Heading3">
     <w:name w:val="heading 3"/>
-    <w:basedOn w:val="Titolo"/>
+    <w:basedOn w:val="Titolouser"/>
     <w:qFormat/>
     <w:pPr/>
     <w:rPr>
@@ -870,7 +913,7 @@
   </w:style>
   <w:style w:type="paragraph" w:styleId="Heading4">
     <w:name w:val="heading 4"/>
-    <w:basedOn w:val="Titolo"/>
+    <w:basedOn w:val="Titolouser"/>
     <w:qFormat/>
     <w:pPr/>
     <w:rPr>
@@ -881,7 +924,7 @@
   </w:style>
   <w:style w:type="paragraph" w:styleId="Heading5">
     <w:name w:val="heading 5"/>
-    <w:basedOn w:val="Titolo"/>
+    <w:basedOn w:val="Titolouser"/>
     <w:qFormat/>
     <w:pPr/>
     <w:rPr>
@@ -890,7 +933,7 @@
   </w:style>
   <w:style w:type="paragraph" w:styleId="Heading6">
     <w:name w:val="heading 6"/>
-    <w:basedOn w:val="Titolo"/>
+    <w:basedOn w:val="Titolouser"/>
     <w:qFormat/>
     <w:pPr/>
     <w:rPr>
@@ -906,11 +949,18 @@
       <w:u w:val="single"/>
     </w:rPr>
   </w:style>
-  <w:style w:type="character" w:styleId="Caratterinotaapidipagina">
-    <w:name w:val="Caratteri nota a piè di pagina"/>
+  <w:style w:type="character" w:styleId="Caratterinotaapidipaginauser">
+    <w:name w:val="Caratteri nota a piè di pagina (user)"/>
     <w:uiPriority w:val="99"/>
     <w:semiHidden/>
     <w:unhideWhenUsed/>
+    <w:qFormat/>
+    <w:rPr>
+      <w:vertAlign w:val="superscript"/>
+    </w:rPr>
+  </w:style>
+  <w:style w:type="character" w:styleId="Caratterinotaapidipagina">
+    <w:name w:val="Caratteri nota a piè di pagina"/>
     <w:qFormat/>
     <w:rPr>
       <w:vertAlign w:val="superscript"/>
@@ -933,11 +983,18 @@
       <w:szCs w:val="20"/>
     </w:rPr>
   </w:style>
-  <w:style w:type="character" w:styleId="Caratterinotadichiusura">
-    <w:name w:val="Caratteri nota di chiusura"/>
+  <w:style w:type="character" w:styleId="Caratterinotadichiusurauser">
+    <w:name w:val="Caratteri nota di chiusura (user)"/>
     <w:uiPriority w:val="99"/>
     <w:semiHidden/>
     <w:unhideWhenUsed/>
+    <w:qFormat/>
+    <w:rPr>
+      <w:vertAlign w:val="superscript"/>
+    </w:rPr>
+  </w:style>
+  <w:style w:type="character" w:styleId="Caratterinotadichiusura">
+    <w:name w:val="Caratteri nota di chiusura"/>
     <w:qFormat/>
     <w:rPr>
       <w:vertAlign w:val="superscript"/>
@@ -1018,9 +1075,35 @@
       <w:rFonts w:cs="Noto Sans Devanagari"/>
     </w:rPr>
   </w:style>
+  <w:style w:type="paragraph" w:styleId="Titolouser">
+    <w:name w:val="Titolo (user)"/>
+    <w:basedOn w:val="Normal"/>
+    <w:next w:val="BodyText"/>
+    <w:qFormat/>
+    <w:pPr>
+      <w:keepNext w:val="true"/>
+      <w:spacing w:before="240" w:after="120"/>
+    </w:pPr>
+    <w:rPr>
+      <w:rFonts w:ascii="Liberation Sans" w:hAnsi="Liberation Sans" w:eastAsia="Noto Sans CJK SC" w:cs="Noto Sans Devanagari"/>
+      <w:sz w:val="28"/>
+      <w:szCs w:val="28"/>
+    </w:rPr>
+  </w:style>
+  <w:style w:type="paragraph" w:styleId="Indiceuser">
+    <w:name w:val="Indice (user)"/>
+    <w:basedOn w:val="Normal"/>
+    <w:qFormat/>
+    <w:pPr>
+      <w:suppressLineNumbers/>
+    </w:pPr>
+    <w:rPr>
+      <w:rFonts w:cs="Noto Sans Devanagari"/>
+    </w:rPr>
+  </w:style>
   <w:style w:type="paragraph" w:styleId="Title">
     <w:name w:val="Title"/>
-    <w:basedOn w:val="Titolo"/>
+    <w:basedOn w:val="Titolouser"/>
     <w:qFormat/>
     <w:pPr/>
     <w:rPr>
@@ -1033,6 +1116,7 @@
     <w:qFormat/>
     <w:pPr>
       <w:widowControl/>
+      <w:suppressAutoHyphens w:val="true"/>
       <w:bidi w:val="0"/>
       <w:spacing w:before="0" w:after="0"/>
       <w:jc w:val="start"/>
@@ -1053,6 +1137,7 @@
     <w:qFormat/>
     <w:pPr>
       <w:widowControl/>
+      <w:suppressAutoHyphens w:val="true"/>
       <w:bidi w:val="0"/>
       <w:spacing w:before="0" w:after="0"/>
       <w:jc w:val="start"/>

</xml_diff>